<commit_message>
Version initiale du deck FX3_slides
</commit_message>
<xml_diff>
--- a/enonces/FX_enonces.docx
+++ b/enonces/FX_enonces.docx
@@ -91,14 +91,9 @@
       </w:r>
     </w:p>
     <w:p>
-      <w:pPr>
-        <w:sectPr>
-          <w:pgSz w:w="11906" w:h="16838" w:orient="portrait"/>
-          <w:pgMar w:top="1440" w:right="1440" w:bottom="1440" w:left="1440" w:header="708" w:footer="708" w:gutter="0"/>
-          <w:pgNumType/>
-          <w:docGrid w:linePitch="360"/>
-        </w:sectPr>
-      </w:pPr>
+      <w:r>
+        <w:br w:type="page"/>
+      </w:r>
     </w:p>
     <w:p>
       <w:pPr>
@@ -5699,9 +5694,84 @@
           <w:sz w:val="22"/>
           <w:szCs w:val="22"/>
         </w:rPr>
-        <w:t xml:space="preserve">Construire une application complète, et séparer ce qui s'affiche de ce qui calcule.</w:t>
-      </w:r>
-    </w:p>
+        <w:t xml:space="preserve">Construire une application complète, de l'écran au calcul, et séparer ce qui s'affiche de ce qui calcule.</w:t>
+      </w:r>
+    </w:p>
+    <w:tbl>
+      <w:tblPr>
+        <w:tblW w:type="dxa" w:w="9360"/>
+        <w:tblBorders>
+          <w:top w:val="single" w:color="A6A6A6" w:sz="2"/>
+          <w:left w:val="single" w:color="1F4E79" w:sz="12"/>
+          <w:bottom w:val="single" w:color="A6A6A6" w:sz="2"/>
+          <w:right w:val="single" w:color="A6A6A6" w:sz="2"/>
+          <w:insideH w:val="none"/>
+          <w:insideV w:val="none"/>
+        </w:tblBorders>
+      </w:tblPr>
+      <w:tblGrid>
+        <w:gridCol w:w="9360"/>
+      </w:tblGrid>
+      <w:tr>
+        <w:trPr>
+          <w:cantSplit/>
+        </w:trPr>
+        <w:tc>
+          <w:tcPr>
+            <w:tcW w:type="dxa" w:w="9360"/>
+            <w:shd w:fill="F7F9FC" w:val="clear"/>
+            <w:tcMar>
+              <w:top w:type="dxa" w:w="120"/>
+              <w:left w:type="dxa" w:w="160"/>
+              <w:bottom w:type="dxa" w:w="120"/>
+              <w:right w:type="dxa" w:w="160"/>
+            </w:tcMar>
+          </w:tcPr>
+          <w:p>
+            <w:pPr>
+              <w:spacing w:after="80"/>
+            </w:pPr>
+            <w:r>
+              <w:rPr>
+                <w:b/>
+                <w:bCs/>
+                <w:sz w:val="22"/>
+                <w:szCs w:val="22"/>
+              </w:rPr>
+              <w:t xml:space="preserve">Un exercice guidé</w:t>
+            </w:r>
+          </w:p>
+          <w:p>
+            <w:pPr>
+              <w:spacing w:after="0"/>
+            </w:pPr>
+            <w:r>
+              <w:rPr>
+                <w:sz w:val="22"/>
+                <w:szCs w:val="22"/>
+              </w:rPr>
+              <w:t xml:space="preserve">Cet exercice se fait en suivant le deck </w:t>
+            </w:r>
+            <w:r>
+              <w:rPr>
+                <w:rFonts w:ascii="Consolas" w:cs="Consolas" w:eastAsia="Consolas" w:hAnsi="Consolas"/>
+                <w:color w:val="8B2500"/>
+                <w:sz w:val="22"/>
+                <w:szCs w:val="22"/>
+              </w:rPr>
+              <w:t xml:space="preserve">FX3</w:t>
+            </w:r>
+            <w:r>
+              <w:rPr>
+                <w:sz w:val="22"/>
+                <w:szCs w:val="22"/>
+              </w:rPr>
+              <w:t xml:space="preserve"> — « La calculatrice, pas à pas ». Il construit la calculatrice étape par étape, dans l'ordre où vous l'écrivez : la vue d'abord, puis le contrôleur branché sur ses boutons, enfin le modèle et les opérateurs. Gardez le deck ouvert à côté de votre projet, et faites chaque étape au moment où il la montre.</w:t>
+            </w:r>
+          </w:p>
+        </w:tc>
+      </w:tr>
+    </w:tbl>
     <w:p>
       <w:pPr>
         <w:pStyle w:val="Heading2"/>
@@ -5976,7 +6046,7 @@
                 <w:sz w:val="20"/>
                 <w:szCs w:val="20"/>
               </w:rPr>
-              <w:t xml:space="preserve">calculatrice.fxml — fourni</w:t>
+              <w:t xml:space="preserve">calculatrice.fxml — à écrire</w:t>
             </w:r>
           </w:p>
         </w:tc>
@@ -6108,7 +6178,7 @@
           <w:sz w:val="24"/>
           <w:szCs w:val="24"/>
         </w:rPr>
-        <w:t xml:space="preserve">Le FXML, et les deux mécanismes à comprendre</w:t>
+        <w:t xml:space="preserve">La vue, à écrire</w:t>
       </w:r>
     </w:p>
     <w:p>
@@ -6120,7 +6190,469 @@
           <w:sz w:val="22"/>
           <w:szCs w:val="22"/>
         </w:rPr>
-        <w:t xml:space="preserve">La vue vous est fournie. Lisez-la : tout ce qu'elle contient remplace du code que vous auriez écrit à la main dans les huit exercices précédents.</w:t>
+        <w:t xml:space="preserve">Le squelette ne contient que la racine de la vue : une </w:t>
+      </w:r>
+      <w:r>
+        <w:rPr>
+          <w:rFonts w:ascii="Consolas" w:cs="Consolas" w:eastAsia="Consolas" w:hAnsi="Consolas"/>
+          <w:color w:val="8B2500"/>
+          <w:sz w:val="22"/>
+          <w:szCs w:val="22"/>
+        </w:rPr>
+        <w:t xml:space="preserve">VBox</w:t>
+      </w:r>
+      <w:r>
+        <w:rPr>
+          <w:sz w:val="22"/>
+          <w:szCs w:val="22"/>
+        </w:rPr>
+        <w:t xml:space="preserve"> qui nomme son contrôleur. Vous écrivez le reste en suivant la section 2 du deck </w:t>
+      </w:r>
+      <w:r>
+        <w:rPr>
+          <w:rFonts w:ascii="Consolas" w:cs="Consolas" w:eastAsia="Consolas" w:hAnsi="Consolas"/>
+          <w:color w:val="8B2500"/>
+          <w:sz w:val="22"/>
+          <w:szCs w:val="22"/>
+        </w:rPr>
+        <w:t xml:space="preserve">FX3</w:t>
+      </w:r>
+      <w:r>
+        <w:rPr>
+          <w:sz w:val="22"/>
+          <w:szCs w:val="22"/>
+        </w:rPr>
+        <w:t xml:space="preserve"> : l'écran, puis les quatre lignes de touches. Tout ce que le fichier contiendra remplace du code que vous auriez écrit à la main dans les huit exercices précédents.</w:t>
+      </w:r>
+    </w:p>
+    <w:p>
+      <w:pPr>
+        <w:pStyle w:val="Heading2"/>
+        <w:keepNext/>
+        <w:spacing w:after="100" w:before="240"/>
+      </w:pPr>
+      <w:r>
+        <w:rPr>
+          <w:b/>
+          <w:bCs/>
+          <w:color w:val="595959"/>
+          <w:sz w:val="24"/>
+          <w:szCs w:val="24"/>
+        </w:rPr>
+        <w:t xml:space="preserve">La vue attendue</w:t>
+      </w:r>
+    </w:p>
+    <w:tbl>
+      <w:tblPr>
+        <w:tblW w:type="dxa" w:w="9360"/>
+        <w:tblBorders>
+          <w:top w:val="single" w:color="auto" w:sz="4"/>
+          <w:left w:val="single" w:color="auto" w:sz="4"/>
+          <w:bottom w:val="single" w:color="auto" w:sz="4"/>
+          <w:right w:val="single" w:color="auto" w:sz="4"/>
+          <w:insideH w:val="single" w:color="auto" w:sz="4"/>
+          <w:insideV w:val="single" w:color="auto" w:sz="4"/>
+        </w:tblBorders>
+      </w:tblPr>
+      <w:tblGrid>
+        <w:gridCol w:w="2200"/>
+        <w:gridCol w:w="4300"/>
+        <w:gridCol w:w="2860"/>
+      </w:tblGrid>
+      <w:tr>
+        <w:trPr>
+          <w:tblHeader/>
+        </w:trPr>
+        <w:tc>
+          <w:tcPr>
+            <w:tcW w:type="dxa" w:w="2200"/>
+            <w:shd w:fill="DEEAF6" w:val="clear"/>
+            <w:tcMar>
+              <w:top w:type="dxa" w:w="55"/>
+              <w:left w:type="dxa" w:w="100"/>
+              <w:bottom w:type="dxa" w:w="55"/>
+              <w:right w:type="dxa" w:w="100"/>
+            </w:tcMar>
+          </w:tcPr>
+          <w:p>
+            <w:pPr>
+              <w:spacing w:after="0"/>
+            </w:pPr>
+            <w:r>
+              <w:rPr>
+                <w:b/>
+                <w:bCs/>
+                <w:sz w:val="20"/>
+                <w:szCs w:val="20"/>
+              </w:rPr>
+              <w:t xml:space="preserve">Élément</w:t>
+            </w:r>
+          </w:p>
+        </w:tc>
+        <w:tc>
+          <w:tcPr>
+            <w:tcW w:type="dxa" w:w="4300"/>
+            <w:shd w:fill="DEEAF6" w:val="clear"/>
+            <w:tcMar>
+              <w:top w:type="dxa" w:w="55"/>
+              <w:left w:type="dxa" w:w="100"/>
+              <w:bottom w:type="dxa" w:w="55"/>
+              <w:right w:type="dxa" w:w="100"/>
+            </w:tcMar>
+          </w:tcPr>
+          <w:p>
+            <w:pPr>
+              <w:spacing w:after="0"/>
+            </w:pPr>
+            <w:r>
+              <w:rPr>
+                <w:b/>
+                <w:bCs/>
+                <w:sz w:val="20"/>
+                <w:szCs w:val="20"/>
+              </w:rPr>
+              <w:t xml:space="preserve">Contenu</w:t>
+            </w:r>
+          </w:p>
+        </w:tc>
+        <w:tc>
+          <w:tcPr>
+            <w:tcW w:type="dxa" w:w="2860"/>
+            <w:shd w:fill="DEEAF6" w:val="clear"/>
+            <w:tcMar>
+              <w:top w:type="dxa" w:w="55"/>
+              <w:left w:type="dxa" w:w="100"/>
+              <w:bottom w:type="dxa" w:w="55"/>
+              <w:right w:type="dxa" w:w="100"/>
+            </w:tcMar>
+          </w:tcPr>
+          <w:p>
+            <w:pPr>
+              <w:spacing w:after="0"/>
+            </w:pPr>
+            <w:r>
+              <w:rPr>
+                <w:b/>
+                <w:bCs/>
+                <w:sz w:val="20"/>
+                <w:szCs w:val="20"/>
+              </w:rPr>
+              <w:t xml:space="preserve">Dimensions</w:t>
+            </w:r>
+          </w:p>
+        </w:tc>
+      </w:tr>
+      <w:tr>
+        <w:trPr>
+          <w:cantSplit/>
+        </w:trPr>
+        <w:tc>
+          <w:tcPr>
+            <w:tcW w:type="dxa" w:w="2200"/>
+            <w:tcMar>
+              <w:top w:type="dxa" w:w="55"/>
+              <w:left w:type="dxa" w:w="100"/>
+              <w:bottom w:type="dxa" w:w="55"/>
+              <w:right w:type="dxa" w:w="100"/>
+            </w:tcMar>
+          </w:tcPr>
+          <w:p>
+            <w:pPr>
+              <w:spacing w:after="0"/>
+            </w:pPr>
+            <w:r>
+              <w:rPr>
+                <w:rFonts w:ascii="Consolas" w:cs="Consolas" w:eastAsia="Consolas" w:hAnsi="Consolas"/>
+                <w:sz w:val="18"/>
+                <w:szCs w:val="18"/>
+              </w:rPr>
+              <w:t xml:space="preserve">VBox (la racine)</w:t>
+            </w:r>
+          </w:p>
+        </w:tc>
+        <w:tc>
+          <w:tcPr>
+            <w:tcW w:type="dxa" w:w="4300"/>
+            <w:tcMar>
+              <w:top w:type="dxa" w:w="55"/>
+              <w:left w:type="dxa" w:w="100"/>
+              <w:bottom w:type="dxa" w:w="55"/>
+              <w:right w:type="dxa" w:w="100"/>
+            </w:tcMar>
+          </w:tcPr>
+          <w:p>
+            <w:pPr>
+              <w:spacing w:after="0"/>
+            </w:pPr>
+            <w:r>
+              <w:rPr>
+                <w:sz w:val="20"/>
+                <w:szCs w:val="20"/>
+              </w:rPr>
+              <w:t xml:space="preserve">l'écran, puis quatre lignes de touches</w:t>
+            </w:r>
+          </w:p>
+        </w:tc>
+        <w:tc>
+          <w:tcPr>
+            <w:tcW w:type="dxa" w:w="2860"/>
+            <w:tcMar>
+              <w:top w:type="dxa" w:w="55"/>
+              <w:left w:type="dxa" w:w="100"/>
+              <w:bottom w:type="dxa" w:w="55"/>
+              <w:right w:type="dxa" w:w="100"/>
+            </w:tcMar>
+          </w:tcPr>
+          <w:p>
+            <w:pPr>
+              <w:spacing w:after="0"/>
+            </w:pPr>
+            <w:r>
+              <w:rPr>
+                <w:sz w:val="20"/>
+                <w:szCs w:val="20"/>
+              </w:rPr>
+              <w:t xml:space="preserve">300 × 300, espacement 10, centrée</w:t>
+            </w:r>
+          </w:p>
+        </w:tc>
+      </w:tr>
+      <w:tr>
+        <w:trPr>
+          <w:cantSplit/>
+        </w:trPr>
+        <w:tc>
+          <w:tcPr>
+            <w:tcW w:type="dxa" w:w="2200"/>
+            <w:tcMar>
+              <w:top w:type="dxa" w:w="55"/>
+              <w:left w:type="dxa" w:w="100"/>
+              <w:bottom w:type="dxa" w:w="55"/>
+              <w:right w:type="dxa" w:w="100"/>
+            </w:tcMar>
+          </w:tcPr>
+          <w:p>
+            <w:pPr>
+              <w:spacing w:after="0"/>
+            </w:pPr>
+            <w:r>
+              <w:rPr>
+                <w:rFonts w:ascii="Consolas" w:cs="Consolas" w:eastAsia="Consolas" w:hAnsi="Consolas"/>
+                <w:sz w:val="18"/>
+                <w:szCs w:val="18"/>
+              </w:rPr>
+              <w:t xml:space="preserve">StackPane</w:t>
+            </w:r>
+          </w:p>
+        </w:tc>
+        <w:tc>
+          <w:tcPr>
+            <w:tcW w:type="dxa" w:w="4300"/>
+            <w:tcMar>
+              <w:top w:type="dxa" w:w="55"/>
+              <w:left w:type="dxa" w:w="100"/>
+              <w:bottom w:type="dxa" w:w="55"/>
+              <w:right w:type="dxa" w:w="100"/>
+            </w:tcMar>
+          </w:tcPr>
+          <w:p>
+            <w:pPr>
+              <w:spacing w:after="0"/>
+            </w:pPr>
+            <w:r>
+              <w:rPr>
+                <w:sz w:val="20"/>
+                <w:szCs w:val="20"/>
+              </w:rPr>
+              <w:t xml:space="preserve">un Rectangle (le cadre) et le Text affichage</w:t>
+            </w:r>
+          </w:p>
+        </w:tc>
+        <w:tc>
+          <w:tcPr>
+            <w:tcW w:type="dxa" w:w="2860"/>
+            <w:tcMar>
+              <w:top w:type="dxa" w:w="55"/>
+              <w:left w:type="dxa" w:w="100"/>
+              <w:bottom w:type="dxa" w:w="55"/>
+              <w:right w:type="dxa" w:w="100"/>
+            </w:tcMar>
+          </w:tcPr>
+          <w:p>
+            <w:pPr>
+              <w:spacing w:after="0"/>
+            </w:pPr>
+            <w:r>
+              <w:rPr>
+                <w:sz w:val="20"/>
+                <w:szCs w:val="20"/>
+              </w:rPr>
+              <w:t xml:space="preserve">cadre de 230 × 50</w:t>
+            </w:r>
+          </w:p>
+        </w:tc>
+      </w:tr>
+      <w:tr>
+        <w:trPr>
+          <w:cantSplit/>
+        </w:trPr>
+        <w:tc>
+          <w:tcPr>
+            <w:tcW w:type="dxa" w:w="2200"/>
+            <w:tcMar>
+              <w:top w:type="dxa" w:w="55"/>
+              <w:left w:type="dxa" w:w="100"/>
+              <w:bottom w:type="dxa" w:w="55"/>
+              <w:right w:type="dxa" w:w="100"/>
+            </w:tcMar>
+          </w:tcPr>
+          <w:p>
+            <w:pPr>
+              <w:spacing w:after="0"/>
+            </w:pPr>
+            <w:r>
+              <w:rPr>
+                <w:rFonts w:ascii="Consolas" w:cs="Consolas" w:eastAsia="Consolas" w:hAnsi="Consolas"/>
+                <w:sz w:val="18"/>
+                <w:szCs w:val="18"/>
+              </w:rPr>
+              <w:t xml:space="preserve">HBox × 4</w:t>
+            </w:r>
+          </w:p>
+        </w:tc>
+        <w:tc>
+          <w:tcPr>
+            <w:tcW w:type="dxa" w:w="4300"/>
+            <w:tcMar>
+              <w:top w:type="dxa" w:w="55"/>
+              <w:left w:type="dxa" w:w="100"/>
+              <w:bottom w:type="dxa" w:w="55"/>
+              <w:right w:type="dxa" w:w="100"/>
+            </w:tcMar>
+          </w:tcPr>
+          <w:p>
+            <w:pPr>
+              <w:spacing w:after="0"/>
+            </w:pPr>
+            <w:r>
+              <w:rPr>
+                <w:sz w:val="20"/>
+                <w:szCs w:val="20"/>
+              </w:rPr>
+              <w:t xml:space="preserve">7 8 9 / — 4 5 6 x — 1 2 3 - — 0 C = +</w:t>
+            </w:r>
+          </w:p>
+        </w:tc>
+        <w:tc>
+          <w:tcPr>
+            <w:tcW w:type="dxa" w:w="2860"/>
+            <w:tcMar>
+              <w:top w:type="dxa" w:w="55"/>
+              <w:left w:type="dxa" w:w="100"/>
+              <w:bottom w:type="dxa" w:w="55"/>
+              <w:right w:type="dxa" w:w="100"/>
+            </w:tcMar>
+          </w:tcPr>
+          <w:p>
+            <w:pPr>
+              <w:spacing w:after="0"/>
+            </w:pPr>
+            <w:r>
+              <w:rPr>
+                <w:sz w:val="20"/>
+                <w:szCs w:val="20"/>
+              </w:rPr>
+              <w:t xml:space="preserve">espacement 10, centrées</w:t>
+            </w:r>
+          </w:p>
+        </w:tc>
+      </w:tr>
+      <w:tr>
+        <w:trPr>
+          <w:cantSplit/>
+        </w:trPr>
+        <w:tc>
+          <w:tcPr>
+            <w:tcW w:type="dxa" w:w="2200"/>
+            <w:tcMar>
+              <w:top w:type="dxa" w:w="55"/>
+              <w:left w:type="dxa" w:w="100"/>
+              <w:bottom w:type="dxa" w:w="55"/>
+              <w:right w:type="dxa" w:w="100"/>
+            </w:tcMar>
+          </w:tcPr>
+          <w:p>
+            <w:pPr>
+              <w:spacing w:after="0"/>
+            </w:pPr>
+            <w:r>
+              <w:rPr>
+                <w:rFonts w:ascii="Consolas" w:cs="Consolas" w:eastAsia="Consolas" w:hAnsi="Consolas"/>
+                <w:sz w:val="18"/>
+                <w:szCs w:val="18"/>
+              </w:rPr>
+              <w:t xml:space="preserve">Button</w:t>
+            </w:r>
+          </w:p>
+        </w:tc>
+        <w:tc>
+          <w:tcPr>
+            <w:tcW w:type="dxa" w:w="4300"/>
+            <w:tcMar>
+              <w:top w:type="dxa" w:w="55"/>
+              <w:left w:type="dxa" w:w="100"/>
+              <w:bottom w:type="dxa" w:w="55"/>
+              <w:right w:type="dxa" w:w="100"/>
+            </w:tcMar>
+          </w:tcPr>
+          <w:p>
+            <w:pPr>
+              <w:spacing w:after="0"/>
+            </w:pPr>
+            <w:r>
+              <w:rPr>
+                <w:sz w:val="20"/>
+                <w:szCs w:val="20"/>
+              </w:rPr>
+              <w:t xml:space="preserve">une touche</w:t>
+            </w:r>
+          </w:p>
+        </w:tc>
+        <w:tc>
+          <w:tcPr>
+            <w:tcW w:type="dxa" w:w="2860"/>
+            <w:tcMar>
+              <w:top w:type="dxa" w:w="55"/>
+              <w:left w:type="dxa" w:w="100"/>
+              <w:bottom w:type="dxa" w:w="55"/>
+              <w:right w:type="dxa" w:w="100"/>
+            </w:tcMar>
+          </w:tcPr>
+          <w:p>
+            <w:pPr>
+              <w:spacing w:after="0"/>
+            </w:pPr>
+            <w:r>
+              <w:rPr>
+                <w:sz w:val="20"/>
+                <w:szCs w:val="20"/>
+              </w:rPr>
+              <w:t xml:space="preserve">50 × 50</w:t>
+            </w:r>
+          </w:p>
+        </w:tc>
+      </w:tr>
+    </w:tbl>
+    <w:p>
+      <w:pPr>
+        <w:spacing w:after="120"/>
+      </w:pPr>
+      <w:r>
+        <w:rPr>
+          <w:sz w:val="22"/>
+          <w:szCs w:val="22"/>
+        </w:rPr>
+        <w:t xml:space="preserve">Trois attributs relient cette vue au contrôleur :</w:t>
       </w:r>
     </w:p>
     <w:tbl>
@@ -6408,7 +6940,7 @@
           <w:sz w:val="22"/>
           <w:szCs w:val="22"/>
         </w:rPr>
-        <w:t xml:space="preserve">. </w:t>
+        <w:t xml:space="preserve">, après avoir écrit la vue. </w:t>
       </w:r>
       <w:r>
         <w:rPr>
@@ -6424,7 +6956,23 @@
           <w:sz w:val="22"/>
           <w:szCs w:val="22"/>
         </w:rPr>
-        <w:t xml:space="preserve"> et le FXML vous sont fournis.</w:t>
+        <w:t xml:space="preserve"> et </w:t>
+      </w:r>
+      <w:r>
+        <w:rPr>
+          <w:rFonts w:ascii="Consolas" w:cs="Consolas" w:eastAsia="Consolas" w:hAnsi="Consolas"/>
+          <w:color w:val="8B2500"/>
+          <w:sz w:val="22"/>
+          <w:szCs w:val="22"/>
+        </w:rPr>
+        <w:t xml:space="preserve">Lanceur</w:t>
+      </w:r>
+      <w:r>
+        <w:rPr>
+          <w:sz w:val="22"/>
+          <w:szCs w:val="22"/>
+        </w:rPr>
+        <w:t xml:space="preserve"> vous sont fournis.</w:t>
       </w:r>
     </w:p>
     <w:tbl>
@@ -7200,10 +7748,9 @@
       </w:r>
     </w:p>
     <w:sectPr>
-      <w:footerReference w:type="default" r:id="rId8"/>
       <w:pgSz w:w="11906" w:h="16838" w:orient="portrait"/>
       <w:pgMar w:top="1440" w:right="1440" w:bottom="1440" w:left="1440" w:header="708" w:footer="708" w:gutter="0"/>
-      <w:pgNumType w:start="1"/>
+      <w:pgNumType/>
       <w:docGrid w:linePitch="360"/>
     </w:sectPr>
   </w:body>
@@ -7249,67 +7796,6 @@
     </w:p>
   </w:endnote>
 </w:endnotes>
-</file>
-
-<file path=word/footer1.xml><?xml version="1.0" encoding="utf-8"?>
-<w:ftr xmlns:w="http://schemas.openxmlformats.org/wordprocessingml/2006/main">
-  <w:p>
-    <w:pPr>
-      <w:jc w:val="center"/>
-      <w:rPr>
-        <w:sz w:val="18"/>
-        <w:szCs w:val="18"/>
-        <w:color w:val="595959"/>
-      </w:rPr>
-    </w:pPr>
-    <w:r>
-      <w:rPr>
-        <w:sz w:val="18"/>
-        <w:szCs w:val="18"/>
-        <w:color w:val="595959"/>
-      </w:rPr>
-      <w:t xml:space="preserve">FX_enonces </w:t>
-    </w:r>
-    <w:r>
-      <w:fldChar w:fldCharType="begin"/>
-    </w:r>
-    <w:r>
-      <w:instrText xml:space="preserve"> PAGE </w:instrText>
-    </w:r>
-    <w:r>
-      <w:fldChar w:fldCharType="separate"/>
-    </w:r>
-    <w:r>
-      <w:t>1</w:t>
-    </w:r>
-    <w:r>
-      <w:fldChar w:fldCharType="end"/>
-    </w:r>
-    <w:r>
-      <w:rPr>
-        <w:sz w:val="18"/>
-        <w:szCs w:val="18"/>
-        <w:color w:val="595959"/>
-      </w:rPr>
-      <w:t xml:space="preserve"> / </w:t>
-    </w:r>
-    <w:r>
-      <w:fldChar w:fldCharType="begin"/>
-    </w:r>
-    <w:r>
-      <w:instrText xml:space="preserve"> SECTIONPAGES </w:instrText>
-    </w:r>
-    <w:r>
-      <w:fldChar w:fldCharType="separate"/>
-    </w:r>
-    <w:r>
-      <w:t>12</w:t>
-    </w:r>
-    <w:r>
-      <w:fldChar w:fldCharType="end"/>
-    </w:r>
-  </w:p>
-</w:ftr>
 </file>
 
 <file path=word/footnotes.xml><?xml version="1.0" encoding="utf-8"?>

</xml_diff>